<commit_message>
Extend training history to 2010
</commit_message>
<xml_diff>
--- a/report/Report.docx
+++ b/report/Report.docx
@@ -103,7 +103,7 @@
         <w:pStyle w:val="ListBullet"/>
       </w:pPr>
       <w:r>
-        <w:t>seasons from 2011 to 2026</w:t>
+        <w:t>seasons from 2010 to 2026</w:t>
       </w:r>
     </w:p>
     <w:p>
@@ -338,7 +338,7 @@
     </w:p>
     <w:p>
       <w:r>
-        <w:t>uses three hidden layers:</w:t>
+        <w:t>uses two hidden layers:</w:t>
       </w:r>
     </w:p>
     <w:p>
@@ -346,7 +346,7 @@
         <w:pStyle w:val="ListBullet"/>
       </w:pPr>
       <w:r>
-        <w:t>hidden layers: 128, 64 and 32 neurons</w:t>
+        <w:t>hidden layers: 128 and 64 neurons</w:t>
       </w:r>
     </w:p>
     <w:p>
@@ -362,7 +362,7 @@
         <w:pStyle w:val="ListBullet"/>
       </w:pPr>
       <w:r>
-        <w:t>alpha: 0.004</w:t>
+        <w:t>alpha: 0.002</w:t>
       </w:r>
     </w:p>
     <w:p>
@@ -370,7 +370,7 @@
         <w:pStyle w:val="ListBullet"/>
       </w:pPr>
       <w:r>
-        <w:t>learning rate: 0.0006</w:t>
+        <w:t>learning rate: 0.0005</w:t>
       </w:r>
     </w:p>
     <w:p>
@@ -421,12 +421,7 @@
     </w:p>
     <w:p>
       <w:r>
-        <w:t>The best holdout finish-position model is a histogram gradient boosting</w:t>
-      </w:r>
-    </w:p>
-    <w:p>
-      <w:r>
-        <w:t>regressor:</w:t>
+        <w:t>The best holdout finish-position model is a neural-network MLP regressor:</w:t>
       </w:r>
     </w:p>
     <w:p>
@@ -434,7 +429,7 @@
         <w:pStyle w:val="ListBullet"/>
       </w:pPr>
       <w:r>
-        <w:t>race precision@10: 0.775</w:t>
+        <w:t>race precision@10: 0.779</w:t>
       </w:r>
     </w:p>
     <w:p>
@@ -442,7 +437,7 @@
         <w:pStyle w:val="ListBullet"/>
       </w:pPr>
       <w:r>
-        <w:t>raw position MAE: 3.25 positions</w:t>
+        <w:t>raw position MAE: 3.20 positions</w:t>
       </w:r>
     </w:p>
     <w:p>
@@ -450,7 +445,7 @@
         <w:pStyle w:val="ListBullet"/>
       </w:pPr>
       <w:r>
-        <w:t>actual-top-10 rank MAE: 2.60 positions</w:t>
+        <w:t>actual-top-10 rank MAE: 2.66 positions</w:t>
       </w:r>
     </w:p>
     <w:p>
@@ -458,7 +453,7 @@
         <w:pStyle w:val="ListBullet"/>
       </w:pPr>
       <w:r>
-        <w:t>mean race Spearman correlation: 0.648</w:t>
+        <w:t>mean race Spearman correlation: 0.660</w:t>
       </w:r>
     </w:p>
     <w:p>
@@ -558,7 +553,7 @@
         <w:pStyle w:val="ListBullet"/>
       </w:pPr>
       <w:r>
-        <w:t>accuracy: 0.770</w:t>
+        <w:t>accuracy: 0.785</w:t>
       </w:r>
     </w:p>
     <w:p>
@@ -566,7 +561,7 @@
         <w:pStyle w:val="ListBullet"/>
       </w:pPr>
       <w:r>
-        <w:t>precision: 0.763</w:t>
+        <w:t>precision: 0.789</w:t>
       </w:r>
     </w:p>
     <w:p>
@@ -582,7 +577,7 @@
         <w:pStyle w:val="ListBullet"/>
       </w:pPr>
       <w:r>
-        <w:t>F1: 0.771</w:t>
+        <w:t>F1: 0.784</w:t>
       </w:r>
     </w:p>
     <w:p>
@@ -590,7 +585,7 @@
         <w:pStyle w:val="ListBullet"/>
       </w:pPr>
       <w:r>
-        <w:t>ROC-AUC: 0.833</w:t>
+        <w:t>ROC-AUC: 0.831</w:t>
       </w:r>
     </w:p>
     <w:p>
@@ -611,7 +606,7 @@
         <w:pStyle w:val="ListBullet"/>
       </w:pPr>
       <w:r>
-        <w:t>average accuracy: 0.782</w:t>
+        <w:t>average accuracy: 0.777</w:t>
       </w:r>
     </w:p>
     <w:p>
@@ -619,7 +614,7 @@
         <w:pStyle w:val="ListBullet"/>
       </w:pPr>
       <w:r>
-        <w:t>average F1: 0.780</w:t>
+        <w:t>average F1: 0.777</w:t>
       </w:r>
     </w:p>
     <w:p>
@@ -627,7 +622,7 @@
         <w:pStyle w:val="ListBullet"/>
       </w:pPr>
       <w:r>
-        <w:t>average ROC-AUC: 0.851</w:t>
+        <w:t>average ROC-AUC: 0.849</w:t>
       </w:r>
     </w:p>
     <w:p>
@@ -635,7 +630,7 @@
         <w:pStyle w:val="ListBullet"/>
       </w:pPr>
       <w:r>
-        <w:t>average race precision@10: 0.773</w:t>
+        <w:t>average race precision@10: 0.767</w:t>
       </w:r>
     </w:p>
     <w:p>
@@ -708,7 +703,15 @@
         <w:pStyle w:val="ListBullet"/>
       </w:pPr>
       <w:r>
-        <w:t>Open-Meteo historical weather is available for all 314 local race-result</w:t>
+        <w:t>2010 was imported incrementally, adding 19 races and 456 supervised rows</w:t>
+      </w:r>
+    </w:p>
+    <w:p>
+      <w:pPr>
+        <w:pStyle w:val="ListBullet"/>
+      </w:pPr>
+      <w:r>
+        <w:t>Open-Meteo historical weather is available for all 333 local race-result</w:t>
       </w:r>
     </w:p>
     <w:p>
@@ -749,7 +752,7 @@
     </w:p>
     <w:p>
       <w:r>
-        <w:t>Miami results, historical weather and race-control history. Upcoming-race</w:t>
+        <w:t>2010, Miami results, historical weather and race-control history. Upcoming-race</w:t>
       </w:r>
     </w:p>
     <w:p>
@@ -759,7 +762,7 @@
     </w:p>
     <w:p>
       <w:r>
-        <w:t>model. A 3D Plotly visualization was also added for the neural-network hidden</w:t>
+        <w:t>model. A 3D Plotly visualization is included for the neural-network hidden</w:t>
       </w:r>
     </w:p>
     <w:p>

</xml_diff>